<commit_message>
Add Step 15: Local File System storage runbook (host pulls CodeCommit) + Key Fixes updates
</commit_message>
<xml_diff>
--- a/WikiJS_Docker_Setup_Guide.docx
+++ b/WikiJS_Docker_Setup_Guide.docx
@@ -2503,6 +2503,972 @@
         <w:spacing w:before="240"/>
       </w:pPr>
       <w:r>
+        <w:t xml:space="preserve">Step 15: (Alternative) Render Docs via Local File System (Host Pulls CodeCommit)</w:t>
+      </w:r>
+    </w:p>
+    <w:p>
+      <w:pPr>
+        <w:spacing w:after="120"/>
+      </w:pPr>
+      <w:r>
+        <w:t xml:space="preserve">Instead of Wiki.js connecting to CodeCommit directly (Step 14), the HOST pulls CodeCommit into a folder and Wiki.js reads it through the Local File System storage module. The host has working DNS, so this avoids relying on the container for the git pull.</w:t>
+      </w:r>
+    </w:p>
+    <w:p>
+      <w:pPr>
+        <w:pBdr>
+          <w:left w:val="single" w:color="E0B000" w:sz="18" w:space="6"/>
+        </w:pBdr>
+        <w:shd w:fill="FFF4CE" w:color="auto" w:val="clear"/>
+        <w:spacing w:after="160" w:before="60"/>
+      </w:pPr>
+      <w:r>
+        <w:rPr>
+          <w:b/>
+          <w:bCs/>
+        </w:rPr>
+        <w:t xml:space="preserve">NOTE: </w:t>
+      </w:r>
+      <w:r>
+        <w:t xml:space="preserve">Read these limitations first - they are the things that bite people:</w:t>
+      </w:r>
+    </w:p>
+    <w:p>
+      <w:pPr>
+        <w:pStyle w:val="ListParagraph"/>
+        <w:numPr>
+          <w:ilvl w:val="0"/>
+          <w:numId w:val="2"/>
+        </w:numPr>
+        <w:spacing w:after="60"/>
+      </w:pPr>
+      <w:r>
+        <w:t xml:space="preserve">Local File System is PUSH-ONLY (it cannot auto-pull). You load files with the manual 'Import Everything' action. For true auto-pull use the Git module (Step 14) instead.</w:t>
+      </w:r>
+    </w:p>
+    <w:p>
+      <w:pPr>
+        <w:pStyle w:val="ListParagraph"/>
+        <w:numPr>
+          <w:ilvl w:val="0"/>
+          <w:numId w:val="2"/>
+        </w:numPr>
+        <w:spacing w:after="60"/>
+      </w:pPr>
+      <w:r>
+        <w:t xml:space="preserve">The Wiki.js CONTAINER still needs internet for its own UI language strings. Keep the Step 8 masquerade rule AND the resolv.conf mount, or the UI shows raw keys (header.search, comments.title) and 'An unexpected error occurred'.</w:t>
+      </w:r>
+    </w:p>
+    <w:p>
+      <w:pPr>
+        <w:pStyle w:val="ListParagraph"/>
+        <w:numPr>
+          <w:ilvl w:val="0"/>
+          <w:numId w:val="2"/>
+        </w:numPr>
+        <w:spacing w:after="60"/>
+      </w:pPr>
+      <w:r>
+        <w:t xml:space="preserve">Every .md file STILL needs the Wiki.js front-matter header (published: true is what makes a page visible).</w:t>
+      </w:r>
+    </w:p>
+    <w:p>
+      <w:pPr>
+        <w:pStyle w:val="ListParagraph"/>
+        <w:numPr>
+          <w:ilvl w:val="0"/>
+          <w:numId w:val="2"/>
+        </w:numPr>
+        <w:spacing w:after="60"/>
+      </w:pPr>
+      <w:r>
+        <w:t xml:space="preserve">The folder must be owned by the container user (uid from: docker exec wikijs id -u; usually 1000).</w:t>
+      </w:r>
+    </w:p>
+    <w:p>
+      <w:pPr>
+        <w:pStyle w:val="ListParagraph"/>
+        <w:numPr>
+          <w:ilvl w:val="0"/>
+          <w:numId w:val="2"/>
+        </w:numPr>
+        <w:spacing w:after="60"/>
+      </w:pPr>
+      <w:r>
+        <w:t xml:space="preserve">When recreating the container, ALWAYS keep BOTH -v mounts: resolv.conf (internet/UI) AND wiki-content (your docs). Dropping resolv.conf breaks the UI.</w:t>
+      </w:r>
+    </w:p>
+    <w:p>
+      <w:pPr>
+        <w:spacing w:after="120"/>
+      </w:pPr>
+      <w:r>
+        <w:rPr>
+          <w:b/>
+          <w:bCs/>
+        </w:rPr>
+        <w:t xml:space="preserve">15.A  Pull CodeCommit into a SOURCE folder (kept separate so Wiki.js push never conflicts with git):</w:t>
+      </w:r>
+    </w:p>
+    <w:p>
+      <w:pPr>
+        <w:pBdr>
+          <w:left w:val="single" w:color="C8C8C8" w:sz="18" w:space="6"/>
+        </w:pBdr>
+        <w:shd w:fill="F4F4F4" w:color="auto" w:val="clear"/>
+        <w:spacing w:after="0" w:before="60"/>
+      </w:pPr>
+      <w:r>
+        <w:rPr>
+          <w:rFonts w:ascii="Consolas" w:cs="Consolas" w:eastAsia="Consolas" w:hAnsi="Consolas"/>
+          <w:sz w:val="19"/>
+          <w:szCs w:val="19"/>
+        </w:rPr>
+        <w:t xml:space="preserve">dnf install -y git rsync python3 awscli</w:t>
+      </w:r>
+    </w:p>
+    <w:p>
+      <w:pPr>
+        <w:pBdr>
+          <w:left w:val="single" w:color="C8C8C8" w:sz="18" w:space="6"/>
+        </w:pBdr>
+        <w:shd w:fill="F4F4F4" w:color="auto" w:val="clear"/>
+        <w:spacing w:after="0" w:before="0"/>
+      </w:pPr>
+      <w:r>
+        <w:rPr>
+          <w:rFonts w:ascii="Consolas" w:cs="Consolas" w:eastAsia="Consolas" w:hAnsi="Consolas"/>
+          <w:sz w:val="19"/>
+          <w:szCs w:val="19"/>
+        </w:rPr>
+        <w:t xml:space="preserve">git config --global credential.helper '!aws codecommit credential-helper $@'</w:t>
+      </w:r>
+    </w:p>
+    <w:p>
+      <w:pPr>
+        <w:pBdr>
+          <w:left w:val="single" w:color="C8C8C8" w:sz="18" w:space="6"/>
+        </w:pBdr>
+        <w:shd w:fill="F4F4F4" w:color="auto" w:val="clear"/>
+        <w:spacing w:after="0" w:before="0"/>
+      </w:pPr>
+      <w:r>
+        <w:rPr>
+          <w:rFonts w:ascii="Consolas" w:cs="Consolas" w:eastAsia="Consolas" w:hAnsi="Consolas"/>
+          <w:sz w:val="19"/>
+          <w:szCs w:val="19"/>
+        </w:rPr>
+        <w:t xml:space="preserve">git config --global credential.UseHttpPath true</w:t>
+      </w:r>
+    </w:p>
+    <w:p>
+      <w:pPr>
+        <w:pBdr>
+          <w:left w:val="single" w:color="C8C8C8" w:sz="18" w:space="6"/>
+        </w:pBdr>
+        <w:shd w:fill="F4F4F4" w:color="auto" w:val="clear"/>
+        <w:spacing w:after="0" w:before="0"/>
+      </w:pPr>
+      <w:r>
+        <w:rPr>
+          <w:rFonts w:ascii="Consolas" w:cs="Consolas" w:eastAsia="Consolas" w:hAnsi="Consolas"/>
+          <w:sz w:val="19"/>
+          <w:szCs w:val="19"/>
+        </w:rPr>
+        <w:t xml:space="preserve">rm -rf /opt/codecommit-src</w:t>
+      </w:r>
+    </w:p>
+    <w:p>
+      <w:pPr>
+        <w:pBdr>
+          <w:left w:val="single" w:color="C8C8C8" w:sz="18" w:space="6"/>
+        </w:pBdr>
+        <w:shd w:fill="F4F4F4" w:color="auto" w:val="clear"/>
+        <w:spacing w:after="60" w:before="0"/>
+      </w:pPr>
+      <w:r>
+        <w:rPr>
+          <w:rFonts w:ascii="Consolas" w:cs="Consolas" w:eastAsia="Consolas" w:hAnsi="Consolas"/>
+          <w:sz w:val="19"/>
+          <w:szCs w:val="19"/>
+        </w:rPr>
+        <w:t xml:space="preserve">git clone https://git-codecommit.us-east-1.amazonaws.com/v1/repos/&lt;REPO&gt; /opt/codecommit-src</w:t>
+      </w:r>
+    </w:p>
+    <w:p>
+      <w:pPr>
+        <w:pBdr>
+          <w:left w:val="single" w:color="E0B000" w:sz="18" w:space="6"/>
+        </w:pBdr>
+        <w:shd w:fill="FFF4CE" w:color="auto" w:val="clear"/>
+        <w:spacing w:after="160" w:before="60"/>
+      </w:pPr>
+      <w:r>
+        <w:rPr>
+          <w:b/>
+          <w:bCs/>
+        </w:rPr>
+        <w:t xml:space="preserve">NOTE: </w:t>
+      </w:r>
+      <w:r>
+        <w:t xml:space="preserve">The clone authenticates via the EC2 instance role (needs AWSCodeCommitReadOnly) or your SSO session. For SSO: run 'aws sso login --profile &lt;p&gt;' first and add --profile &lt;p&gt; to the credential.helper line.</w:t>
+      </w:r>
+    </w:p>
+    <w:p>
+      <w:pPr>
+        <w:spacing w:after="120"/>
+      </w:pPr>
+      <w:r>
+        <w:t xml:space="preserve">15.B  Copy into a PLAIN folder for Wiki.js (no .git = no overwrite conflict):</w:t>
+      </w:r>
+    </w:p>
+    <w:p>
+      <w:pPr>
+        <w:pBdr>
+          <w:left w:val="single" w:color="C8C8C8" w:sz="18" w:space="6"/>
+        </w:pBdr>
+        <w:shd w:fill="F4F4F4" w:color="auto" w:val="clear"/>
+        <w:spacing w:after="0" w:before="60"/>
+      </w:pPr>
+      <w:r>
+        <w:rPr>
+          <w:rFonts w:ascii="Consolas" w:cs="Consolas" w:eastAsia="Consolas" w:hAnsi="Consolas"/>
+          <w:sz w:val="19"/>
+          <w:szCs w:val="19"/>
+        </w:rPr>
+        <w:t xml:space="preserve">mkdir -p /opt/wiki-content</w:t>
+      </w:r>
+    </w:p>
+    <w:p>
+      <w:pPr>
+        <w:pBdr>
+          <w:left w:val="single" w:color="C8C8C8" w:sz="18" w:space="6"/>
+        </w:pBdr>
+        <w:shd w:fill="F4F4F4" w:color="auto" w:val="clear"/>
+        <w:spacing w:after="60" w:before="0"/>
+      </w:pPr>
+      <w:r>
+        <w:rPr>
+          <w:rFonts w:ascii="Consolas" w:cs="Consolas" w:eastAsia="Consolas" w:hAnsi="Consolas"/>
+          <w:sz w:val="19"/>
+          <w:szCs w:val="19"/>
+        </w:rPr>
+        <w:t xml:space="preserve">rsync -a --delete --exclude '.git' /opt/codecommit-src/ /opt/wiki-content/</w:t>
+      </w:r>
+    </w:p>
+    <w:p>
+      <w:pPr>
+        <w:spacing w:after="120"/>
+      </w:pPr>
+      <w:r>
+        <w:t xml:space="preserve">15.C  Add the Wiki.js header to every .md, then fix ownership for the container user:</w:t>
+      </w:r>
+    </w:p>
+    <w:p>
+      <w:pPr>
+        <w:pBdr>
+          <w:left w:val="single" w:color="C8C8C8" w:sz="18" w:space="6"/>
+        </w:pBdr>
+        <w:shd w:fill="F4F4F4" w:color="auto" w:val="clear"/>
+        <w:spacing w:after="0" w:before="60"/>
+      </w:pPr>
+      <w:r>
+        <w:rPr>
+          <w:rFonts w:ascii="Consolas" w:cs="Consolas" w:eastAsia="Consolas" w:hAnsi="Consolas"/>
+          <w:sz w:val="19"/>
+          <w:szCs w:val="19"/>
+        </w:rPr>
+        <w:t xml:space="preserve">cat &gt; /opt/add_wiki_headers.py &lt;&lt;'PY'</w:t>
+      </w:r>
+    </w:p>
+    <w:p>
+      <w:pPr>
+        <w:pBdr>
+          <w:left w:val="single" w:color="C8C8C8" w:sz="18" w:space="6"/>
+        </w:pBdr>
+        <w:shd w:fill="F4F4F4" w:color="auto" w:val="clear"/>
+        <w:spacing w:after="0" w:before="0"/>
+      </w:pPr>
+      <w:r>
+        <w:rPr>
+          <w:rFonts w:ascii="Consolas" w:cs="Consolas" w:eastAsia="Consolas" w:hAnsi="Consolas"/>
+          <w:sz w:val="19"/>
+          <w:szCs w:val="19"/>
+        </w:rPr>
+        <w:t xml:space="preserve">import os, re, datetime</w:t>
+      </w:r>
+    </w:p>
+    <w:p>
+      <w:pPr>
+        <w:pBdr>
+          <w:left w:val="single" w:color="C8C8C8" w:sz="18" w:space="6"/>
+        </w:pBdr>
+        <w:shd w:fill="F4F4F4" w:color="auto" w:val="clear"/>
+        <w:spacing w:after="0" w:before="0"/>
+      </w:pPr>
+      <w:r>
+        <w:rPr>
+          <w:rFonts w:ascii="Consolas" w:cs="Consolas" w:eastAsia="Consolas" w:hAnsi="Consolas"/>
+          <w:sz w:val="19"/>
+          <w:szCs w:val="19"/>
+        </w:rPr>
+        <w:t xml:space="preserve">ROOT="/opt/wiki-content"</w:t>
+      </w:r>
+    </w:p>
+    <w:p>
+      <w:pPr>
+        <w:pBdr>
+          <w:left w:val="single" w:color="C8C8C8" w:sz="18" w:space="6"/>
+        </w:pBdr>
+        <w:shd w:fill="F4F4F4" w:color="auto" w:val="clear"/>
+        <w:spacing w:after="0" w:before="0"/>
+      </w:pPr>
+      <w:r>
+        <w:rPr>
+          <w:rFonts w:ascii="Consolas" w:cs="Consolas" w:eastAsia="Consolas" w:hAnsi="Consolas"/>
+          <w:sz w:val="19"/>
+          <w:szCs w:val="19"/>
+        </w:rPr>
+        <w:t xml:space="preserve">now=datetime.datetime.utcnow().strftime("%Y-%m-%dT%H:%M:%S.000Z")</w:t>
+      </w:r>
+    </w:p>
+    <w:p>
+      <w:pPr>
+        <w:pBdr>
+          <w:left w:val="single" w:color="C8C8C8" w:sz="18" w:space="6"/>
+        </w:pBdr>
+        <w:shd w:fill="F4F4F4" w:color="auto" w:val="clear"/>
+        <w:spacing w:after="0" w:before="0"/>
+      </w:pPr>
+      <w:r>
+        <w:rPr>
+          <w:rFonts w:ascii="Consolas" w:cs="Consolas" w:eastAsia="Consolas" w:hAnsi="Consolas"/>
+          <w:sz w:val="19"/>
+          <w:szCs w:val="19"/>
+        </w:rPr>
+        <w:t xml:space="preserve">for dp,_,fs in os.walk(ROOT):</w:t>
+      </w:r>
+    </w:p>
+    <w:p>
+      <w:pPr>
+        <w:pBdr>
+          <w:left w:val="single" w:color="C8C8C8" w:sz="18" w:space="6"/>
+        </w:pBdr>
+        <w:shd w:fill="F4F4F4" w:color="auto" w:val="clear"/>
+        <w:spacing w:after="0" w:before="0"/>
+      </w:pPr>
+      <w:r>
+        <w:rPr>
+          <w:rFonts w:ascii="Consolas" w:cs="Consolas" w:eastAsia="Consolas" w:hAnsi="Consolas"/>
+          <w:sz w:val="19"/>
+          <w:szCs w:val="19"/>
+        </w:rPr>
+        <w:t xml:space="preserve">    if ".git" in dp.split(os.sep): continue</w:t>
+      </w:r>
+    </w:p>
+    <w:p>
+      <w:pPr>
+        <w:pBdr>
+          <w:left w:val="single" w:color="C8C8C8" w:sz="18" w:space="6"/>
+        </w:pBdr>
+        <w:shd w:fill="F4F4F4" w:color="auto" w:val="clear"/>
+        <w:spacing w:after="0" w:before="0"/>
+      </w:pPr>
+      <w:r>
+        <w:rPr>
+          <w:rFonts w:ascii="Consolas" w:cs="Consolas" w:eastAsia="Consolas" w:hAnsi="Consolas"/>
+          <w:sz w:val="19"/>
+          <w:szCs w:val="19"/>
+        </w:rPr>
+        <w:t xml:space="preserve">    for f in fs:</w:t>
+      </w:r>
+    </w:p>
+    <w:p>
+      <w:pPr>
+        <w:pBdr>
+          <w:left w:val="single" w:color="C8C8C8" w:sz="18" w:space="6"/>
+        </w:pBdr>
+        <w:shd w:fill="F4F4F4" w:color="auto" w:val="clear"/>
+        <w:spacing w:after="0" w:before="0"/>
+      </w:pPr>
+      <w:r>
+        <w:rPr>
+          <w:rFonts w:ascii="Consolas" w:cs="Consolas" w:eastAsia="Consolas" w:hAnsi="Consolas"/>
+          <w:sz w:val="19"/>
+          <w:szCs w:val="19"/>
+        </w:rPr>
+        <w:t xml:space="preserve">        if not f.lower().endswith(".md"): continue</w:t>
+      </w:r>
+    </w:p>
+    <w:p>
+      <w:pPr>
+        <w:pBdr>
+          <w:left w:val="single" w:color="C8C8C8" w:sz="18" w:space="6"/>
+        </w:pBdr>
+        <w:shd w:fill="F4F4F4" w:color="auto" w:val="clear"/>
+        <w:spacing w:after="0" w:before="0"/>
+      </w:pPr>
+      <w:r>
+        <w:rPr>
+          <w:rFonts w:ascii="Consolas" w:cs="Consolas" w:eastAsia="Consolas" w:hAnsi="Consolas"/>
+          <w:sz w:val="19"/>
+          <w:szCs w:val="19"/>
+        </w:rPr>
+        <w:t xml:space="preserve">        p=os.path.join(dp,f); c=open(p,encoding="utf-8").read()</w:t>
+      </w:r>
+    </w:p>
+    <w:p>
+      <w:pPr>
+        <w:pBdr>
+          <w:left w:val="single" w:color="C8C8C8" w:sz="18" w:space="6"/>
+        </w:pBdr>
+        <w:shd w:fill="F4F4F4" w:color="auto" w:val="clear"/>
+        <w:spacing w:after="0" w:before="0"/>
+      </w:pPr>
+      <w:r>
+        <w:rPr>
+          <w:rFonts w:ascii="Consolas" w:cs="Consolas" w:eastAsia="Consolas" w:hAnsi="Consolas"/>
+          <w:sz w:val="19"/>
+          <w:szCs w:val="19"/>
+        </w:rPr>
+        <w:t xml:space="preserve">        if c.lstrip().startswith("---"): continue</w:t>
+      </w:r>
+    </w:p>
+    <w:p>
+      <w:pPr>
+        <w:pBdr>
+          <w:left w:val="single" w:color="C8C8C8" w:sz="18" w:space="6"/>
+        </w:pBdr>
+        <w:shd w:fill="F4F4F4" w:color="auto" w:val="clear"/>
+        <w:spacing w:after="0" w:before="0"/>
+      </w:pPr>
+      <w:r>
+        <w:rPr>
+          <w:rFonts w:ascii="Consolas" w:cs="Consolas" w:eastAsia="Consolas" w:hAnsi="Consolas"/>
+          <w:sz w:val="19"/>
+          <w:szCs w:val="19"/>
+        </w:rPr>
+        <w:t xml:space="preserve">        m=re.search(r"^#\s+(.+)$",c,re.M)</w:t>
+      </w:r>
+    </w:p>
+    <w:p>
+      <w:pPr>
+        <w:pBdr>
+          <w:left w:val="single" w:color="C8C8C8" w:sz="18" w:space="6"/>
+        </w:pBdr>
+        <w:shd w:fill="F4F4F4" w:color="auto" w:val="clear"/>
+        <w:spacing w:after="0" w:before="0"/>
+      </w:pPr>
+      <w:r>
+        <w:rPr>
+          <w:rFonts w:ascii="Consolas" w:cs="Consolas" w:eastAsia="Consolas" w:hAnsi="Consolas"/>
+          <w:sz w:val="19"/>
+          <w:szCs w:val="19"/>
+        </w:rPr>
+        <w:t xml:space="preserve">        t=(m.group(1).strip() if m else os.path.splitext(f)[0]).replace('"',"'")</w:t>
+      </w:r>
+    </w:p>
+    <w:p>
+      <w:pPr>
+        <w:pBdr>
+          <w:left w:val="single" w:color="C8C8C8" w:sz="18" w:space="6"/>
+        </w:pBdr>
+        <w:shd w:fill="F4F4F4" w:color="auto" w:val="clear"/>
+        <w:spacing w:after="0" w:before="0"/>
+      </w:pPr>
+      <w:r>
+        <w:rPr>
+          <w:rFonts w:ascii="Consolas" w:cs="Consolas" w:eastAsia="Consolas" w:hAnsi="Consolas"/>
+          <w:sz w:val="19"/>
+          <w:szCs w:val="19"/>
+        </w:rPr>
+        <w:t xml:space="preserve">        open(p,"w",encoding="utf-8").write(f"---\ntitle: {t}\ndescription: \npublished: true\ndate: {now}\ntags: \neditor: markdown\ndateCreated: {now}\n---\n\n"+c)</w:t>
+      </w:r>
+    </w:p>
+    <w:p>
+      <w:pPr>
+        <w:pBdr>
+          <w:left w:val="single" w:color="C8C8C8" w:sz="18" w:space="6"/>
+        </w:pBdr>
+        <w:shd w:fill="F4F4F4" w:color="auto" w:val="clear"/>
+        <w:spacing w:after="0" w:before="0"/>
+      </w:pPr>
+      <w:r>
+        <w:rPr>
+          <w:rFonts w:ascii="Consolas" w:cs="Consolas" w:eastAsia="Consolas" w:hAnsi="Consolas"/>
+          <w:sz w:val="19"/>
+          <w:szCs w:val="19"/>
+        </w:rPr>
+        <w:t xml:space="preserve">print("headers done")</w:t>
+      </w:r>
+    </w:p>
+    <w:p>
+      <w:pPr>
+        <w:pBdr>
+          <w:left w:val="single" w:color="C8C8C8" w:sz="18" w:space="6"/>
+        </w:pBdr>
+        <w:shd w:fill="F4F4F4" w:color="auto" w:val="clear"/>
+        <w:spacing w:after="0" w:before="0"/>
+      </w:pPr>
+      <w:r>
+        <w:rPr>
+          <w:rFonts w:ascii="Consolas" w:cs="Consolas" w:eastAsia="Consolas" w:hAnsi="Consolas"/>
+          <w:sz w:val="19"/>
+          <w:szCs w:val="19"/>
+        </w:rPr>
+        <w:t xml:space="preserve">PY</w:t>
+      </w:r>
+    </w:p>
+    <w:p>
+      <w:pPr>
+        <w:pBdr>
+          <w:left w:val="single" w:color="C8C8C8" w:sz="18" w:space="6"/>
+        </w:pBdr>
+        <w:shd w:fill="F4F4F4" w:color="auto" w:val="clear"/>
+        <w:spacing w:after="0" w:before="0"/>
+      </w:pPr>
+      <w:r>
+        <w:rPr>
+          <w:rFonts w:ascii="Consolas" w:cs="Consolas" w:eastAsia="Consolas" w:hAnsi="Consolas"/>
+          <w:sz w:val="19"/>
+          <w:szCs w:val="19"/>
+        </w:rPr>
+        <w:t xml:space="preserve">python3 /opt/add_wiki_headers.py</w:t>
+      </w:r>
+    </w:p>
+    <w:p>
+      <w:pPr>
+        <w:pBdr>
+          <w:left w:val="single" w:color="C8C8C8" w:sz="18" w:space="6"/>
+        </w:pBdr>
+        <w:shd w:fill="F4F4F4" w:color="auto" w:val="clear"/>
+        <w:spacing w:after="0" w:before="0"/>
+      </w:pPr>
+      <w:r>
+        <w:rPr>
+          <w:rFonts w:ascii="Consolas" w:cs="Consolas" w:eastAsia="Consolas" w:hAnsi="Consolas"/>
+          <w:sz w:val="19"/>
+          <w:szCs w:val="19"/>
+        </w:rPr>
+        <w:t xml:space="preserve">CUID=$(docker exec wikijs id -u)</w:t>
+      </w:r>
+    </w:p>
+    <w:p>
+      <w:pPr>
+        <w:pBdr>
+          <w:left w:val="single" w:color="C8C8C8" w:sz="18" w:space="6"/>
+        </w:pBdr>
+        <w:shd w:fill="F4F4F4" w:color="auto" w:val="clear"/>
+        <w:spacing w:after="60" w:before="0"/>
+      </w:pPr>
+      <w:r>
+        <w:rPr>
+          <w:rFonts w:ascii="Consolas" w:cs="Consolas" w:eastAsia="Consolas" w:hAnsi="Consolas"/>
+          <w:sz w:val="19"/>
+          <w:szCs w:val="19"/>
+        </w:rPr>
+        <w:t xml:space="preserve">chown -R ${CUID}:${CUID} /opt/wiki-content</w:t>
+      </w:r>
+    </w:p>
+    <w:p>
+      <w:pPr>
+        <w:spacing w:after="120"/>
+      </w:pPr>
+      <w:r>
+        <w:t xml:space="preserve">15.D  Recreate Wiki.js with BOTH mounts (this is the step people get wrong):</w:t>
+      </w:r>
+    </w:p>
+    <w:p>
+      <w:pPr>
+        <w:pBdr>
+          <w:left w:val="single" w:color="C8C8C8" w:sz="18" w:space="6"/>
+        </w:pBdr>
+        <w:shd w:fill="F4F4F4" w:color="auto" w:val="clear"/>
+        <w:spacing w:after="0" w:before="60"/>
+      </w:pPr>
+      <w:r>
+        <w:rPr>
+          <w:rFonts w:ascii="Consolas" w:cs="Consolas" w:eastAsia="Consolas" w:hAnsi="Consolas"/>
+          <w:sz w:val="19"/>
+          <w:szCs w:val="19"/>
+        </w:rPr>
+        <w:t xml:space="preserve">mkdir -p /opt/wikijs</w:t>
+      </w:r>
+    </w:p>
+    <w:p>
+      <w:pPr>
+        <w:pBdr>
+          <w:left w:val="single" w:color="C8C8C8" w:sz="18" w:space="6"/>
+        </w:pBdr>
+        <w:shd w:fill="F4F4F4" w:color="auto" w:val="clear"/>
+        <w:spacing w:after="0" w:before="0"/>
+      </w:pPr>
+      <w:r>
+        <w:rPr>
+          <w:rFonts w:ascii="Consolas" w:cs="Consolas" w:eastAsia="Consolas" w:hAnsi="Consolas"/>
+          <w:sz w:val="19"/>
+          <w:szCs w:val="19"/>
+        </w:rPr>
+        <w:t xml:space="preserve">[ -f /opt/wikijs/resolv.conf ] || printf 'nameserver 8.8.8.8\nnameserver 1.1.1.1\noptions ndots:0\n' &gt; /opt/wikijs/resolv.conf</w:t>
+      </w:r>
+    </w:p>
+    <w:p>
+      <w:pPr>
+        <w:pBdr>
+          <w:left w:val="single" w:color="C8C8C8" w:sz="18" w:space="6"/>
+        </w:pBdr>
+        <w:shd w:fill="F4F4F4" w:color="auto" w:val="clear"/>
+        <w:spacing w:after="0" w:before="0"/>
+      </w:pPr>
+      <w:r>
+        <w:rPr>
+          <w:rFonts w:ascii="Consolas" w:cs="Consolas" w:eastAsia="Consolas" w:hAnsi="Consolas"/>
+          <w:sz w:val="19"/>
+          <w:szCs w:val="19"/>
+        </w:rPr>
+        <w:t xml:space="preserve">docker inspect wikijs -f '{{range .Config.Env}}{{println .}}{{end}}' | grep -E '^(DB_|WIKI|HA_)' &gt; /opt/wikijs.env</w:t>
+      </w:r>
+    </w:p>
+    <w:p>
+      <w:pPr>
+        <w:pBdr>
+          <w:left w:val="single" w:color="C8C8C8" w:sz="18" w:space="6"/>
+        </w:pBdr>
+        <w:shd w:fill="F4F4F4" w:color="auto" w:val="clear"/>
+        <w:spacing w:after="0" w:before="0"/>
+      </w:pPr>
+      <w:r>
+        <w:rPr>
+          <w:rFonts w:ascii="Consolas" w:cs="Consolas" w:eastAsia="Consolas" w:hAnsi="Consolas"/>
+          <w:sz w:val="19"/>
+          <w:szCs w:val="19"/>
+        </w:rPr>
+        <w:t xml:space="preserve">docker rm -f wikijs</w:t>
+      </w:r>
+    </w:p>
+    <w:p>
+      <w:pPr>
+        <w:pBdr>
+          <w:left w:val="single" w:color="C8C8C8" w:sz="18" w:space="6"/>
+        </w:pBdr>
+        <w:shd w:fill="F4F4F4" w:color="auto" w:val="clear"/>
+        <w:spacing w:after="0" w:before="0"/>
+      </w:pPr>
+      <w:r>
+        <w:rPr>
+          <w:rFonts w:ascii="Consolas" w:cs="Consolas" w:eastAsia="Consolas" w:hAnsi="Consolas"/>
+          <w:sz w:val="19"/>
+          <w:szCs w:val="19"/>
+        </w:rPr>
+        <w:t xml:space="preserve">docker run -d --name wikijs --network wikinet --restart unless-stopped -p 80:3000 \</w:t>
+      </w:r>
+    </w:p>
+    <w:p>
+      <w:pPr>
+        <w:pBdr>
+          <w:left w:val="single" w:color="C8C8C8" w:sz="18" w:space="6"/>
+        </w:pBdr>
+        <w:shd w:fill="F4F4F4" w:color="auto" w:val="clear"/>
+        <w:spacing w:after="0" w:before="0"/>
+      </w:pPr>
+      <w:r>
+        <w:rPr>
+          <w:rFonts w:ascii="Consolas" w:cs="Consolas" w:eastAsia="Consolas" w:hAnsi="Consolas"/>
+          <w:sz w:val="19"/>
+          <w:szCs w:val="19"/>
+        </w:rPr>
+        <w:t xml:space="preserve">  -v /opt/wikijs/resolv.conf:/etc/resolv.conf:ro \</w:t>
+      </w:r>
+    </w:p>
+    <w:p>
+      <w:pPr>
+        <w:pBdr>
+          <w:left w:val="single" w:color="C8C8C8" w:sz="18" w:space="6"/>
+        </w:pBdr>
+        <w:shd w:fill="F4F4F4" w:color="auto" w:val="clear"/>
+        <w:spacing w:after="0" w:before="0"/>
+      </w:pPr>
+      <w:r>
+        <w:rPr>
+          <w:rFonts w:ascii="Consolas" w:cs="Consolas" w:eastAsia="Consolas" w:hAnsi="Consolas"/>
+          <w:sz w:val="19"/>
+          <w:szCs w:val="19"/>
+        </w:rPr>
+        <w:t xml:space="preserve">  -v /opt/wiki-content:/wiki-content \</w:t>
+      </w:r>
+    </w:p>
+    <w:p>
+      <w:pPr>
+        <w:pBdr>
+          <w:left w:val="single" w:color="C8C8C8" w:sz="18" w:space="6"/>
+        </w:pBdr>
+        <w:shd w:fill="F4F4F4" w:color="auto" w:val="clear"/>
+        <w:spacing w:after="0" w:before="0"/>
+      </w:pPr>
+      <w:r>
+        <w:rPr>
+          <w:rFonts w:ascii="Consolas" w:cs="Consolas" w:eastAsia="Consolas" w:hAnsi="Consolas"/>
+          <w:sz w:val="19"/>
+          <w:szCs w:val="19"/>
+        </w:rPr>
+        <w:t xml:space="preserve">  --env-file /opt/wikijs.env \</w:t>
+      </w:r>
+    </w:p>
+    <w:p>
+      <w:pPr>
+        <w:pBdr>
+          <w:left w:val="single" w:color="C8C8C8" w:sz="18" w:space="6"/>
+        </w:pBdr>
+        <w:shd w:fill="F4F4F4" w:color="auto" w:val="clear"/>
+        <w:spacing w:after="0" w:before="0"/>
+      </w:pPr>
+      <w:r>
+        <w:rPr>
+          <w:rFonts w:ascii="Consolas" w:cs="Consolas" w:eastAsia="Consolas" w:hAnsi="Consolas"/>
+          <w:sz w:val="19"/>
+          <w:szCs w:val="19"/>
+        </w:rPr>
+        <w:t xml:space="preserve">  ghcr.io/requarks/wiki:2</w:t>
+      </w:r>
+    </w:p>
+    <w:p>
+      <w:pPr>
+        <w:pBdr>
+          <w:left w:val="single" w:color="C8C8C8" w:sz="18" w:space="6"/>
+        </w:pBdr>
+        <w:shd w:fill="F4F4F4" w:color="auto" w:val="clear"/>
+        <w:spacing w:after="60" w:before="0"/>
+      </w:pPr>
+      <w:r>
+        <w:rPr>
+          <w:rFonts w:ascii="Consolas" w:cs="Consolas" w:eastAsia="Consolas" w:hAnsi="Consolas"/>
+          <w:sz w:val="19"/>
+          <w:szCs w:val="19"/>
+        </w:rPr>
+        <w:t xml:space="preserve">sleep 20</w:t>
+      </w:r>
+    </w:p>
+    <w:p>
+      <w:pPr>
+        <w:spacing w:after="120"/>
+      </w:pPr>
+      <w:r>
+        <w:t xml:space="preserve">15.E  Verify (both must be good):</w:t>
+      </w:r>
+    </w:p>
+    <w:p>
+      <w:pPr>
+        <w:pBdr>
+          <w:left w:val="single" w:color="C8C8C8" w:sz="18" w:space="6"/>
+        </w:pBdr>
+        <w:shd w:fill="F4F4F4" w:color="auto" w:val="clear"/>
+        <w:spacing w:after="0" w:before="60"/>
+      </w:pPr>
+      <w:r>
+        <w:rPr>
+          <w:rFonts w:ascii="Consolas" w:cs="Consolas" w:eastAsia="Consolas" w:hAnsi="Consolas"/>
+          <w:sz w:val="19"/>
+          <w:szCs w:val="19"/>
+        </w:rPr>
+        <w:t xml:space="preserve">docker exec wikijs cat /etc/resolv.conf | head -1</w:t>
+      </w:r>
+    </w:p>
+    <w:p>
+      <w:pPr>
+        <w:pBdr>
+          <w:left w:val="single" w:color="C8C8C8" w:sz="18" w:space="6"/>
+        </w:pBdr>
+        <w:shd w:fill="F4F4F4" w:color="auto" w:val="clear"/>
+        <w:spacing w:after="0" w:before="0"/>
+      </w:pPr>
+      <w:r>
+        <w:rPr>
+          <w:rFonts w:ascii="Consolas" w:cs="Consolas" w:eastAsia="Consolas" w:hAnsi="Consolas"/>
+          <w:sz w:val="19"/>
+          <w:szCs w:val="19"/>
+        </w:rPr>
+        <w:t xml:space="preserve">docker exec wikijs node -e "require('dns').lookup('graph.requarks.io',(e,a)=&gt;console.log(e?'DNS FAIL':'DNS OK'))"</w:t>
+      </w:r>
+    </w:p>
+    <w:p>
+      <w:pPr>
+        <w:pBdr>
+          <w:left w:val="single" w:color="C8C8C8" w:sz="18" w:space="6"/>
+        </w:pBdr>
+        <w:shd w:fill="F4F4F4" w:color="auto" w:val="clear"/>
+        <w:spacing w:after="60" w:before="0"/>
+      </w:pPr>
+      <w:r>
+        <w:rPr>
+          <w:rFonts w:ascii="Consolas" w:cs="Consolas" w:eastAsia="Consolas" w:hAnsi="Consolas"/>
+          <w:sz w:val="19"/>
+          <w:szCs w:val="19"/>
+        </w:rPr>
+        <w:t xml:space="preserve">docker exec wikijs ls /wiki-content</w:t>
+      </w:r>
+    </w:p>
+    <w:p>
+      <w:pPr>
+        <w:pStyle w:val="ListParagraph"/>
+        <w:numPr>
+          <w:ilvl w:val="0"/>
+          <w:numId w:val="2"/>
+        </w:numPr>
+        <w:spacing w:after="60"/>
+      </w:pPr>
+      <w:r>
+        <w:t xml:space="preserve">resolv.conf must show: nameserver 8.8.8.8 (NOT 127.0.0.11)</w:t>
+      </w:r>
+    </w:p>
+    <w:p>
+      <w:pPr>
+        <w:pStyle w:val="ListParagraph"/>
+        <w:numPr>
+          <w:ilvl w:val="0"/>
+          <w:numId w:val="2"/>
+        </w:numPr>
+        <w:spacing w:after="60"/>
+      </w:pPr>
+      <w:r>
+        <w:t xml:space="preserve">DNS test must print: DNS OK</w:t>
+      </w:r>
+    </w:p>
+    <w:p>
+      <w:pPr>
+        <w:pStyle w:val="ListParagraph"/>
+        <w:numPr>
+          <w:ilvl w:val="0"/>
+          <w:numId w:val="2"/>
+        </w:numPr>
+        <w:spacing w:after="60"/>
+      </w:pPr>
+      <w:r>
+        <w:t xml:space="preserve">ls must list your markdown files/folders</w:t>
+      </w:r>
+    </w:p>
+    <w:p>
+      <w:pPr>
+        <w:spacing w:after="120"/>
+      </w:pPr>
+      <w:r>
+        <w:t xml:space="preserve">15.F  In the browser - Administration -&gt; Storage:</w:t>
+      </w:r>
+    </w:p>
+    <w:p>
+      <w:pPr>
+        <w:pStyle w:val="ListParagraph"/>
+        <w:numPr>
+          <w:ilvl w:val="0"/>
+          <w:numId w:val="2"/>
+        </w:numPr>
+        <w:spacing w:after="60"/>
+      </w:pPr>
+      <w:r>
+        <w:t xml:space="preserve">Turn OFF the Git target (so it does not fight Local FS)</w:t>
+      </w:r>
+    </w:p>
+    <w:p>
+      <w:pPr>
+        <w:pStyle w:val="ListParagraph"/>
+        <w:numPr>
+          <w:ilvl w:val="0"/>
+          <w:numId w:val="2"/>
+        </w:numPr>
+        <w:spacing w:after="60"/>
+      </w:pPr>
+      <w:r>
+        <w:t xml:space="preserve">Turn ON Local File System -&gt; set Path = /wiki-content (the CONTAINER path, not the host path)</w:t>
+      </w:r>
+    </w:p>
+    <w:p>
+      <w:pPr>
+        <w:pStyle w:val="ListParagraph"/>
+        <w:numPr>
+          <w:ilvl w:val="0"/>
+          <w:numId w:val="2"/>
+        </w:numPr>
+        <w:spacing w:after="60"/>
+      </w:pPr>
+      <w:r>
+        <w:t xml:space="preserve">Sync Direction stays on 'Push to target' (only supported option)</w:t>
+      </w:r>
+    </w:p>
+    <w:p>
+      <w:pPr>
+        <w:pStyle w:val="ListParagraph"/>
+        <w:numPr>
+          <w:ilvl w:val="0"/>
+          <w:numId w:val="2"/>
+        </w:numPr>
+        <w:spacing w:after="60"/>
+      </w:pPr>
+      <w:r>
+        <w:t xml:space="preserve">Click ACTIONS -&gt; APPLY, then scroll to Actions -&gt; Import Everything</w:t>
+      </w:r>
+    </w:p>
+    <w:p>
+      <w:pPr>
+        <w:pStyle w:val="ListParagraph"/>
+        <w:numPr>
+          <w:ilvl w:val="0"/>
+          <w:numId w:val="2"/>
+        </w:numPr>
+        <w:spacing w:after="60"/>
+      </w:pPr>
+      <w:r>
+        <w:t xml:space="preserve">Hard-refresh the browser (Ctrl+Shift+R) -&gt; pages render and UI labels are correct</w:t>
+      </w:r>
+    </w:p>
+    <w:p>
+      <w:pPr>
+        <w:spacing w:after="120"/>
+      </w:pPr>
+      <w:r>
+        <w:t xml:space="preserve">15.G  Keep it auto-syncing (cron) - re-run Import Everything after new content arrives:</w:t>
+      </w:r>
+    </w:p>
+    <w:p>
+      <w:pPr>
+        <w:pBdr>
+          <w:left w:val="single" w:color="C8C8C8" w:sz="18" w:space="6"/>
+        </w:pBdr>
+        <w:shd w:fill="F4F4F4" w:color="auto" w:val="clear"/>
+        <w:spacing w:after="60" w:before="60"/>
+      </w:pPr>
+      <w:r>
+        <w:rPr>
+          <w:rFonts w:ascii="Consolas" w:cs="Consolas" w:eastAsia="Consolas" w:hAnsi="Consolas"/>
+          <w:sz w:val="19"/>
+          <w:szCs w:val="19"/>
+        </w:rPr>
+        <w:t xml:space="preserve">echo '*/5 * * * * root cd /opt/codecommit-src &amp;&amp; git pull -q &amp;&amp; rsync -a --delete --exclude ".git" /opt/codecommit-src/ /opt/wiki-content/ &amp;&amp; python3 /opt/add_wiki_headers.py &amp;&amp; chown -R 1000:1000 /opt/wiki-content' &gt; /etc/cron.d/wiki-sync</w:t>
+      </w:r>
+    </w:p>
+    <w:p>
+      <w:pPr>
+        <w:pBdr>
+          <w:left w:val="single" w:color="E0B000" w:sz="18" w:space="6"/>
+        </w:pBdr>
+        <w:shd w:fill="FFF4CE" w:color="auto" w:val="clear"/>
+        <w:spacing w:after="160" w:before="60"/>
+      </w:pPr>
+      <w:r>
+        <w:rPr>
+          <w:b/>
+          <w:bCs/>
+        </w:rPr>
+        <w:t xml:space="preserve">NOTE: </w:t>
+      </w:r>
+      <w:r>
+        <w:t xml:space="preserve">Also enable wikinet-nat.service (Step 8c) so the masquerade rule survives reboots - otherwise DNS/UI breaks again after a restart.</w:t>
+      </w:r>
+    </w:p>
+    <w:p>
+      <w:pPr>
+        <w:pStyle w:val="Heading2"/>
+        <w:spacing w:before="240"/>
+      </w:pPr>
+      <w:r>
         <w:t xml:space="preserve">Key Fixes Applied (RHEL 10 Specific)</w:t>
       </w:r>
     </w:p>
@@ -2582,6 +3548,45 @@
       </w:pPr>
       <w:r>
         <w:t xml:space="preserve">Podman alias hijacking docker command -&gt; fixed by removing alias from /root/.bashrc</w:t>
+      </w:r>
+    </w:p>
+    <w:p>
+      <w:pPr>
+        <w:pStyle w:val="ListParagraph"/>
+        <w:numPr>
+          <w:ilvl w:val="0"/>
+          <w:numId w:val="2"/>
+        </w:numPr>
+        <w:spacing w:after="60"/>
+      </w:pPr>
+      <w:r>
+        <w:t xml:space="preserve">Raw UI labels (header.search, comments.title) + 'unexpected error' -&gt; the container could not reach the internet for Wiki.js's UI language strings. The container needs internet (masquerade + resolv.conf mount) even for Local File System storage. Fixed by Step 8.</w:t>
+      </w:r>
+    </w:p>
+    <w:p>
+      <w:pPr>
+        <w:pStyle w:val="ListParagraph"/>
+        <w:numPr>
+          <w:ilvl w:val="0"/>
+          <w:numId w:val="2"/>
+        </w:numPr>
+        <w:spacing w:after="60"/>
+      </w:pPr>
+      <w:r>
+        <w:t xml:space="preserve">Wiki.js Local File System module is PUSH-ONLY (definition.yml supportedModes: [push]); it cannot auto-pull. Use the manual 'Import Everything' action, or the Git module for continuous pull.</w:t>
+      </w:r>
+    </w:p>
+    <w:p>
+      <w:pPr>
+        <w:pStyle w:val="ListParagraph"/>
+        <w:numPr>
+          <w:ilvl w:val="0"/>
+          <w:numId w:val="2"/>
+        </w:numPr>
+        <w:spacing w:after="60"/>
+      </w:pPr>
+      <w:r>
+        <w:t xml:space="preserve">wiki-postgres has NO data volume in this guide - survives stop/start, but 'docker rm wiki-postgres' loses the DB. Add -v /opt/wiki-db:/var/lib/postgresql/data to persist it.</w:t>
       </w:r>
     </w:p>
     <w:sectPr>

</xml_diff>

<commit_message>
Add Step 16: persist Postgres with a named volume (DB survives updates) + verification
</commit_message>
<xml_diff>
--- a/WikiJS_Docker_Setup_Guide.docx
+++ b/WikiJS_Docker_Setup_Guide.docx
@@ -3587,6 +3587,457 @@
       </w:pPr>
       <w:r>
         <w:t xml:space="preserve">wiki-postgres has NO data volume in this guide - survives stop/start, but 'docker rm wiki-postgres' loses the DB. Add -v /opt/wiki-db:/var/lib/postgresql/data to persist it.</w:t>
+      </w:r>
+    </w:p>
+    <w:p>
+      <w:pPr>
+        <w:pStyle w:val="Heading2"/>
+        <w:spacing w:before="240"/>
+      </w:pPr>
+      <w:r>
+        <w:t xml:space="preserve">Step 16: Persist Postgres with a Named Volume (DB survives updates)</w:t>
+      </w:r>
+    </w:p>
+    <w:p>
+      <w:pPr>
+        <w:spacing w:after="120"/>
+      </w:pPr>
+      <w:r>
+        <w:t xml:space="preserve">By default the Postgres data lives on an ANONYMOUS volume tied to the container. When you update/recreate the Postgres container (e.g. image upgrade), that volume is orphaned and the database (users, settings, page history) is effectively lost. A NAMED volume lives outside the container and is reattached by name, so the data survives. (Page content is also in CodeCommit, but users/settings/history live only in the DB.)</w:t>
+      </w:r>
+    </w:p>
+    <w:p>
+      <w:pPr>
+        <w:pBdr>
+          <w:left w:val="single" w:color="E0B000" w:sz="18" w:space="6"/>
+        </w:pBdr>
+        <w:shd w:fill="FFF4CE" w:color="auto" w:val="clear"/>
+        <w:spacing w:after="160" w:before="60"/>
+      </w:pPr>
+      <w:r>
+        <w:rPr>
+          <w:b/>
+          <w:bCs/>
+        </w:rPr>
+        <w:t xml:space="preserve">NOTE: </w:t>
+      </w:r>
+      <w:r>
+        <w:t xml:space="preserve">This needs a short maintenance window (~2-5 min downtime) while Postgres is recreated. ALWAYS take the backup first - do not run the docker rm until the backup is verified non-empty AND the copy printed COPY_OK.</w:t>
+      </w:r>
+    </w:p>
+    <w:p>
+      <w:pPr>
+        <w:spacing w:after="120"/>
+      </w:pPr>
+      <w:r>
+        <w:t xml:space="preserve">16.1  Back up the live database (safety net - keep this file, ideally copy it off-box):</w:t>
+      </w:r>
+    </w:p>
+    <w:p>
+      <w:pPr>
+        <w:pBdr>
+          <w:left w:val="single" w:color="C8C8C8" w:sz="18" w:space="6"/>
+        </w:pBdr>
+        <w:shd w:fill="F4F4F4" w:color="auto" w:val="clear"/>
+        <w:spacing w:after="0" w:before="60"/>
+      </w:pPr>
+      <w:r>
+        <w:rPr>
+          <w:rFonts w:ascii="Consolas" w:cs="Consolas" w:eastAsia="Consolas" w:hAnsi="Consolas"/>
+          <w:sz w:val="19"/>
+          <w:szCs w:val="19"/>
+        </w:rPr>
+        <w:t xml:space="preserve">docker exec wiki-postgres pg_dumpall -U wiki &gt; /opt/wiki-db-backup-$(date +%F).sql</w:t>
+      </w:r>
+    </w:p>
+    <w:p>
+      <w:pPr>
+        <w:pBdr>
+          <w:left w:val="single" w:color="C8C8C8" w:sz="18" w:space="6"/>
+        </w:pBdr>
+        <w:shd w:fill="F4F4F4" w:color="auto" w:val="clear"/>
+        <w:spacing w:after="60" w:before="0"/>
+      </w:pPr>
+      <w:r>
+        <w:rPr>
+          <w:rFonts w:ascii="Consolas" w:cs="Consolas" w:eastAsia="Consolas" w:hAnsi="Consolas"/>
+          <w:sz w:val="19"/>
+          <w:szCs w:val="19"/>
+        </w:rPr>
+        <w:t xml:space="preserve">ls -lh /opt/wiki-db-backup-*.sql</w:t>
+      </w:r>
+    </w:p>
+    <w:p>
+      <w:pPr>
+        <w:spacing w:after="120"/>
+      </w:pPr>
+      <w:r>
+        <w:t xml:space="preserve">16.2  Stop Wiki.js, create the named volume, and copy the current data into it:</w:t>
+      </w:r>
+    </w:p>
+    <w:p>
+      <w:pPr>
+        <w:pBdr>
+          <w:left w:val="single" w:color="C8C8C8" w:sz="18" w:space="6"/>
+        </w:pBdr>
+        <w:shd w:fill="F4F4F4" w:color="auto" w:val="clear"/>
+        <w:spacing w:after="0" w:before="60"/>
+      </w:pPr>
+      <w:r>
+        <w:rPr>
+          <w:rFonts w:ascii="Consolas" w:cs="Consolas" w:eastAsia="Consolas" w:hAnsi="Consolas"/>
+          <w:sz w:val="19"/>
+          <w:szCs w:val="19"/>
+        </w:rPr>
+        <w:t xml:space="preserve">docker stop wikijs</w:t>
+      </w:r>
+    </w:p>
+    <w:p>
+      <w:pPr>
+        <w:pBdr>
+          <w:left w:val="single" w:color="C8C8C8" w:sz="18" w:space="6"/>
+        </w:pBdr>
+        <w:shd w:fill="F4F4F4" w:color="auto" w:val="clear"/>
+        <w:spacing w:after="0" w:before="0"/>
+      </w:pPr>
+      <w:r>
+        <w:rPr>
+          <w:rFonts w:ascii="Consolas" w:cs="Consolas" w:eastAsia="Consolas" w:hAnsi="Consolas"/>
+          <w:sz w:val="19"/>
+          <w:szCs w:val="19"/>
+        </w:rPr>
+        <w:t xml:space="preserve">docker volume create wiki_pgdata</w:t>
+      </w:r>
+    </w:p>
+    <w:p>
+      <w:pPr>
+        <w:pBdr>
+          <w:left w:val="single" w:color="C8C8C8" w:sz="18" w:space="6"/>
+        </w:pBdr>
+        <w:shd w:fill="F4F4F4" w:color="auto" w:val="clear"/>
+        <w:spacing w:after="60" w:before="0"/>
+      </w:pPr>
+      <w:r>
+        <w:rPr>
+          <w:rFonts w:ascii="Consolas" w:cs="Consolas" w:eastAsia="Consolas" w:hAnsi="Consolas"/>
+          <w:sz w:val="19"/>
+          <w:szCs w:val="19"/>
+        </w:rPr>
+        <w:t xml:space="preserve">docker run --rm --volumes-from wiki-postgres -v wiki_pgdata:/dest alpine sh -c "cp -a /var/lib/postgresql/data/. /dest/ &amp;&amp; echo COPY_OK"</w:t>
+      </w:r>
+    </w:p>
+    <w:p>
+      <w:pPr>
+        <w:pBdr>
+          <w:left w:val="single" w:color="E0B000" w:sz="18" w:space="6"/>
+        </w:pBdr>
+        <w:shd w:fill="FFF4CE" w:color="auto" w:val="clear"/>
+        <w:spacing w:after="160" w:before="60"/>
+      </w:pPr>
+      <w:r>
+        <w:rPr>
+          <w:b/>
+          <w:bCs/>
+        </w:rPr>
+        <w:t xml:space="preserve">NOTE: </w:t>
+      </w:r>
+      <w:r>
+        <w:t xml:space="preserve">Proceed to 16.3 ONLY if the previous command printed COPY_OK.</w:t>
+      </w:r>
+    </w:p>
+    <w:p>
+      <w:pPr>
+        <w:spacing w:after="120"/>
+      </w:pPr>
+      <w:r>
+        <w:t xml:space="preserve">16.3  Recreate Postgres attached to the named volume (use your REAL DB password):</w:t>
+      </w:r>
+    </w:p>
+    <w:p>
+      <w:pPr>
+        <w:pBdr>
+          <w:left w:val="single" w:color="C8C8C8" w:sz="18" w:space="6"/>
+        </w:pBdr>
+        <w:shd w:fill="F4F4F4" w:color="auto" w:val="clear"/>
+        <w:spacing w:after="0" w:before="60"/>
+      </w:pPr>
+      <w:r>
+        <w:rPr>
+          <w:rFonts w:ascii="Consolas" w:cs="Consolas" w:eastAsia="Consolas" w:hAnsi="Consolas"/>
+          <w:sz w:val="19"/>
+          <w:szCs w:val="19"/>
+        </w:rPr>
+        <w:t xml:space="preserve">docker rm -f wiki-postgres</w:t>
+      </w:r>
+    </w:p>
+    <w:p>
+      <w:pPr>
+        <w:pBdr>
+          <w:left w:val="single" w:color="C8C8C8" w:sz="18" w:space="6"/>
+        </w:pBdr>
+        <w:shd w:fill="F4F4F4" w:color="auto" w:val="clear"/>
+        <w:spacing w:after="0" w:before="0"/>
+      </w:pPr>
+      <w:r>
+        <w:rPr>
+          <w:rFonts w:ascii="Consolas" w:cs="Consolas" w:eastAsia="Consolas" w:hAnsi="Consolas"/>
+          <w:sz w:val="19"/>
+          <w:szCs w:val="19"/>
+        </w:rPr>
+        <w:t xml:space="preserve">docker run -d --name wiki-postgres --network wikinet --ip 172.20.0.2 --restart unless-stopped \</w:t>
+      </w:r>
+    </w:p>
+    <w:p>
+      <w:pPr>
+        <w:pBdr>
+          <w:left w:val="single" w:color="C8C8C8" w:sz="18" w:space="6"/>
+        </w:pBdr>
+        <w:shd w:fill="F4F4F4" w:color="auto" w:val="clear"/>
+        <w:spacing w:after="0" w:before="0"/>
+      </w:pPr>
+      <w:r>
+        <w:rPr>
+          <w:rFonts w:ascii="Consolas" w:cs="Consolas" w:eastAsia="Consolas" w:hAnsi="Consolas"/>
+          <w:sz w:val="19"/>
+          <w:szCs w:val="19"/>
+        </w:rPr>
+        <w:t xml:space="preserve">  -e POSTGRES_DB=wiki -e POSTGRES_USER=wiki -e POSTGRES_PASSWORD='P@ssw0rd' \</w:t>
+      </w:r>
+    </w:p>
+    <w:p>
+      <w:pPr>
+        <w:pBdr>
+          <w:left w:val="single" w:color="C8C8C8" w:sz="18" w:space="6"/>
+        </w:pBdr>
+        <w:shd w:fill="F4F4F4" w:color="auto" w:val="clear"/>
+        <w:spacing w:after="0" w:before="0"/>
+      </w:pPr>
+      <w:r>
+        <w:rPr>
+          <w:rFonts w:ascii="Consolas" w:cs="Consolas" w:eastAsia="Consolas" w:hAnsi="Consolas"/>
+          <w:sz w:val="19"/>
+          <w:szCs w:val="19"/>
+        </w:rPr>
+        <w:t xml:space="preserve">  -v wiki_pgdata:/var/lib/postgresql/data \</w:t>
+      </w:r>
+    </w:p>
+    <w:p>
+      <w:pPr>
+        <w:pBdr>
+          <w:left w:val="single" w:color="C8C8C8" w:sz="18" w:space="6"/>
+        </w:pBdr>
+        <w:shd w:fill="F4F4F4" w:color="auto" w:val="clear"/>
+        <w:spacing w:after="0" w:before="0"/>
+      </w:pPr>
+      <w:r>
+        <w:rPr>
+          <w:rFonts w:ascii="Consolas" w:cs="Consolas" w:eastAsia="Consolas" w:hAnsi="Consolas"/>
+          <w:sz w:val="19"/>
+          <w:szCs w:val="19"/>
+        </w:rPr>
+        <w:t xml:space="preserve">  postgres:15</w:t>
+      </w:r>
+    </w:p>
+    <w:p>
+      <w:pPr>
+        <w:pBdr>
+          <w:left w:val="single" w:color="C8C8C8" w:sz="18" w:space="6"/>
+        </w:pBdr>
+        <w:shd w:fill="F4F4F4" w:color="auto" w:val="clear"/>
+        <w:spacing w:after="0" w:before="0"/>
+      </w:pPr>
+      <w:r>
+        <w:rPr>
+          <w:rFonts w:ascii="Consolas" w:cs="Consolas" w:eastAsia="Consolas" w:hAnsi="Consolas"/>
+          <w:sz w:val="19"/>
+          <w:szCs w:val="19"/>
+        </w:rPr>
+        <w:t xml:space="preserve">sleep 12</w:t>
+      </w:r>
+    </w:p>
+    <w:p>
+      <w:pPr>
+        <w:pBdr>
+          <w:left w:val="single" w:color="C8C8C8" w:sz="18" w:space="6"/>
+        </w:pBdr>
+        <w:shd w:fill="F4F4F4" w:color="auto" w:val="clear"/>
+        <w:spacing w:after="60" w:before="0"/>
+      </w:pPr>
+      <w:r>
+        <w:rPr>
+          <w:rFonts w:ascii="Consolas" w:cs="Consolas" w:eastAsia="Consolas" w:hAnsi="Consolas"/>
+          <w:sz w:val="19"/>
+          <w:szCs w:val="19"/>
+        </w:rPr>
+        <w:t xml:space="preserve">docker start wikijs</w:t>
+      </w:r>
+    </w:p>
+    <w:p>
+      <w:pPr>
+        <w:spacing w:after="120"/>
+      </w:pPr>
+      <w:r>
+        <w:t xml:space="preserve">16.4  Verify the migration worked:</w:t>
+      </w:r>
+    </w:p>
+    <w:p>
+      <w:pPr>
+        <w:pBdr>
+          <w:left w:val="single" w:color="C8C8C8" w:sz="18" w:space="6"/>
+        </w:pBdr>
+        <w:shd w:fill="F4F4F4" w:color="auto" w:val="clear"/>
+        <w:spacing w:after="0" w:before="60"/>
+      </w:pPr>
+      <w:r>
+        <w:rPr>
+          <w:rFonts w:ascii="Consolas" w:cs="Consolas" w:eastAsia="Consolas" w:hAnsi="Consolas"/>
+          <w:sz w:val="19"/>
+          <w:szCs w:val="19"/>
+        </w:rPr>
+        <w:t xml:space="preserve"># Postgres must now report the NAMED volume (not a random hash):</w:t>
+      </w:r>
+    </w:p>
+    <w:p>
+      <w:pPr>
+        <w:pBdr>
+          <w:left w:val="single" w:color="C8C8C8" w:sz="18" w:space="6"/>
+        </w:pBdr>
+        <w:shd w:fill="F4F4F4" w:color="auto" w:val="clear"/>
+        <w:spacing w:after="0" w:before="0"/>
+      </w:pPr>
+      <w:r>
+        <w:rPr>
+          <w:rFonts w:ascii="Consolas" w:cs="Consolas" w:eastAsia="Consolas" w:hAnsi="Consolas"/>
+          <w:sz w:val="19"/>
+          <w:szCs w:val="19"/>
+        </w:rPr>
+        <w:t xml:space="preserve">docker inspect wiki-postgres -f '{{range .Mounts}}name={{.Name}} -&gt; {{.Destination}}{{"\n"}}{{end}}'</w:t>
+      </w:r>
+    </w:p>
+    <w:p>
+      <w:pPr>
+        <w:pBdr>
+          <w:left w:val="single" w:color="C8C8C8" w:sz="18" w:space="6"/>
+        </w:pBdr>
+        <w:shd w:fill="F4F4F4" w:color="auto" w:val="clear"/>
+        <w:spacing w:after="0" w:before="0"/>
+      </w:pPr>
+      <w:r>
+        <w:rPr>
+          <w:rFonts w:ascii="Consolas" w:cs="Consolas" w:eastAsia="Consolas" w:hAnsi="Consolas"/>
+          <w:sz w:val="19"/>
+          <w:szCs w:val="19"/>
+        </w:rPr>
+        <w:t xml:space="preserve"># the named volume must contain a real PG data dir:</w:t>
+      </w:r>
+    </w:p>
+    <w:p>
+      <w:pPr>
+        <w:pBdr>
+          <w:left w:val="single" w:color="C8C8C8" w:sz="18" w:space="6"/>
+        </w:pBdr>
+        <w:shd w:fill="F4F4F4" w:color="auto" w:val="clear"/>
+        <w:spacing w:after="0" w:before="0"/>
+      </w:pPr>
+      <w:r>
+        <w:rPr>
+          <w:rFonts w:ascii="Consolas" w:cs="Consolas" w:eastAsia="Consolas" w:hAnsi="Consolas"/>
+          <w:sz w:val="19"/>
+          <w:szCs w:val="19"/>
+        </w:rPr>
+        <w:t xml:space="preserve">docker run --rm -v wiki_pgdata:/d alpine ls /d</w:t>
+      </w:r>
+    </w:p>
+    <w:p>
+      <w:pPr>
+        <w:pBdr>
+          <w:left w:val="single" w:color="C8C8C8" w:sz="18" w:space="6"/>
+        </w:pBdr>
+        <w:shd w:fill="F4F4F4" w:color="auto" w:val="clear"/>
+        <w:spacing w:after="0" w:before="0"/>
+      </w:pPr>
+      <w:r>
+        <w:rPr>
+          <w:rFonts w:ascii="Consolas" w:cs="Consolas" w:eastAsia="Consolas" w:hAnsi="Consolas"/>
+          <w:sz w:val="19"/>
+          <w:szCs w:val="19"/>
+        </w:rPr>
+        <w:t xml:space="preserve"># your tables/data are intact:</w:t>
+      </w:r>
+    </w:p>
+    <w:p>
+      <w:pPr>
+        <w:pBdr>
+          <w:left w:val="single" w:color="C8C8C8" w:sz="18" w:space="6"/>
+        </w:pBdr>
+        <w:shd w:fill="F4F4F4" w:color="auto" w:val="clear"/>
+        <w:spacing w:after="60" w:before="0"/>
+      </w:pPr>
+      <w:r>
+        <w:rPr>
+          <w:rFonts w:ascii="Consolas" w:cs="Consolas" w:eastAsia="Consolas" w:hAnsi="Consolas"/>
+          <w:sz w:val="19"/>
+          <w:szCs w:val="19"/>
+        </w:rPr>
+        <w:t xml:space="preserve">docker exec wiki-postgres psql -U wiki -d wiki -c "\dt"</w:t>
+      </w:r>
+    </w:p>
+    <w:p>
+      <w:pPr>
+        <w:pStyle w:val="ListParagraph"/>
+        <w:numPr>
+          <w:ilvl w:val="0"/>
+          <w:numId w:val="2"/>
+        </w:numPr>
+        <w:spacing w:after="60"/>
+      </w:pPr>
+      <w:r>
+        <w:t xml:space="preserve">docker inspect must show: name=wiki_pgdata -&gt; /var/lib/postgresql/data (NOT a 64-char hash)</w:t>
+      </w:r>
+    </w:p>
+    <w:p>
+      <w:pPr>
+        <w:pStyle w:val="ListParagraph"/>
+        <w:numPr>
+          <w:ilvl w:val="0"/>
+          <w:numId w:val="2"/>
+        </w:numPr>
+        <w:spacing w:after="60"/>
+      </w:pPr>
+      <w:r>
+        <w:t xml:space="preserve">ls of the volume must list: PG_VERSION, base, global, pg_wal, postgresql.conf ...</w:t>
+      </w:r>
+    </w:p>
+    <w:p>
+      <w:pPr>
+        <w:pStyle w:val="ListParagraph"/>
+        <w:numPr>
+          <w:ilvl w:val="0"/>
+          <w:numId w:val="2"/>
+        </w:numPr>
+        <w:spacing w:after="60"/>
+      </w:pPr>
+      <w:r>
+        <w:t xml:space="preserve">\dt must list your tables; open the wiki and confirm pages/users are intact</w:t>
+      </w:r>
+    </w:p>
+    <w:p>
+      <w:pPr>
+        <w:pBdr>
+          <w:left w:val="single" w:color="E0B000" w:sz="18" w:space="6"/>
+        </w:pBdr>
+        <w:shd w:fill="FFF4CE" w:color="auto" w:val="clear"/>
+        <w:spacing w:after="160" w:before="60"/>
+      </w:pPr>
+      <w:r>
+        <w:rPr>
+          <w:b/>
+          <w:bCs/>
+        </w:rPr>
+        <w:t xml:space="preserve">NOTE: </w:t>
+      </w:r>
+      <w:r>
+        <w:t xml:space="preserve">From now on you can upgrade the Postgres image (e.g. postgres:15 -&gt; postgres:16) and the data stays, because wiki_pgdata is reattached by name every time. If the verify fails, the DB is still recoverable from the 16.1 backup: restore with  cat /opt/wiki-db-backup-*.sql | docker exec -i wiki-postgres psql -U wiki -d wiki</w:t>
       </w:r>
     </w:p>
     <w:sectPr>

</xml_diff>